<commit_message>
Finalisasi SDLC Production Grade - Upload Multer & Makalah
</commit_message>
<xml_diff>
--- a/Makalah_UTS_SIAKAD_Reborn.docx
+++ b/Makalah_UTS_SIAKAD_Reborn.docx
@@ -1307,7 +1307,7 @@
           <w:b/>
           <w:sz w:val="24"/>
         </w:rPr>
-        <w:t>BAB VIII KESIMPULAN DAN SARAN</w:t>
+        <w:t>BAB VIII PEMELIHARAAN (MAINTENANCE)</w:t>
       </w:r>
       <w:r>
         <w:rPr>
@@ -1328,7 +1328,7 @@
           <w:rFonts w:ascii="Times New Roman" w:hAnsi="Times New Roman"/>
           <w:sz w:val="24"/>
         </w:rPr>
-        <w:t>8.1 Kesimpulan</w:t>
+        <w:t>8.1 Rencana Pemeliharaan</w:t>
       </w:r>
       <w:r>
         <w:rPr>
@@ -1349,7 +1349,7 @@
           <w:rFonts w:ascii="Times New Roman" w:hAnsi="Times New Roman"/>
           <w:sz w:val="24"/>
         </w:rPr>
-        <w:t>8.2 Saran Pengembangan</w:t>
+        <w:t>8.2 Perawatan Sistem</w:t>
       </w:r>
       <w:r>
         <w:rPr>
@@ -1358,6 +1358,70 @@
         </w:rPr>
         <w:tab/>
         <w:t>24</w:t>
+      </w:r>
+    </w:p>
+    <w:p/>
+    <w:p>
+      <w:pPr>
+        <w:spacing w:line="360" w:lineRule="auto"/>
+      </w:pPr>
+      <w:r>
+        <w:rPr>
+          <w:rFonts w:ascii="Times New Roman" w:hAnsi="Times New Roman"/>
+          <w:b/>
+          <w:sz w:val="24"/>
+        </w:rPr>
+        <w:t>BAB IX KESIMPULAN DAN SARAN</w:t>
+      </w:r>
+      <w:r>
+        <w:rPr>
+          <w:rFonts w:ascii="Times New Roman" w:hAnsi="Times New Roman"/>
+          <w:sz w:val="24"/>
+        </w:rPr>
+        <w:tab/>
+        <w:t>25</w:t>
+      </w:r>
+    </w:p>
+    <w:p>
+      <w:pPr>
+        <w:spacing w:line="360" w:lineRule="auto"/>
+        <w:ind w:left="567"/>
+      </w:pPr>
+      <w:r>
+        <w:rPr>
+          <w:rFonts w:ascii="Times New Roman" w:hAnsi="Times New Roman"/>
+          <w:sz w:val="24"/>
+        </w:rPr>
+        <w:t>9.1 Kesimpulan</w:t>
+      </w:r>
+      <w:r>
+        <w:rPr>
+          <w:rFonts w:ascii="Times New Roman" w:hAnsi="Times New Roman"/>
+          <w:sz w:val="24"/>
+        </w:rPr>
+        <w:tab/>
+        <w:t>25</w:t>
+      </w:r>
+    </w:p>
+    <w:p>
+      <w:pPr>
+        <w:spacing w:line="360" w:lineRule="auto"/>
+        <w:ind w:left="567"/>
+      </w:pPr>
+      <w:r>
+        <w:rPr>
+          <w:rFonts w:ascii="Times New Roman" w:hAnsi="Times New Roman"/>
+          <w:sz w:val="24"/>
+        </w:rPr>
+        <w:t>9.2 Saran Pengembangan</w:t>
+      </w:r>
+      <w:r>
+        <w:rPr>
+          <w:rFonts w:ascii="Times New Roman" w:hAnsi="Times New Roman"/>
+          <w:sz w:val="24"/>
+        </w:rPr>
+        <w:tab/>
+        <w:t>25</w:t>
       </w:r>
     </w:p>
     <w:p/>
@@ -1379,7 +1443,7 @@
           <w:sz w:val="24"/>
         </w:rPr>
         <w:tab/>
-        <w:t>25</w:t>
+        <w:t>26</w:t>
       </w:r>
     </w:p>
     <w:p>
@@ -1400,7 +1464,7 @@
           <w:sz w:val="24"/>
         </w:rPr>
         <w:tab/>
-        <w:t>26</w:t>
+        <w:t>27</w:t>
       </w:r>
     </w:p>
     <w:p>
@@ -8557,6 +8621,21 @@
     </w:p>
     <w:p>
       <w:pPr>
+        <w:spacing w:after="120" w:line="360" w:lineRule="auto"/>
+      </w:pPr>
+      <w:r>
+        <w:rPr>
+          <w:rFonts w:ascii="Times New Roman" w:hAnsi="Times New Roman" w:cs="Times New Roman"/>
+          <w:rFonts w:ascii="Times New Roman" w:hAnsi="Times New Roman"/>
+          <w:b/>
+          <w:i w:val="0"/>
+          <w:sz w:val="24"/>
+        </w:rPr>
+        <w:t>Integrasi Fungsional 100%: Pada tahap penyempurnaan terbaru (Full-Stack Data Integration), atribut-atribut krusial seperti proses unggah berkas (CNP, UTS, UAS, dan Foto Profil) yang semula merupakan mock-up visual kini telah menggunakan Engine Multer berbasis Node.js yang mengirimkan fisik file (Multipart) dan mengkonversi URL di tabel MySQL. Fungsi "Lupa Kata Sandi" kini juga tidak lagi berupa tautan statis, melainkan fitur validasi dua-faktor (NIM dan Tanggal Lahir) tersambung riil ke Database XAMPP.</w:t>
+      </w:r>
+    </w:p>
+    <w:p>
+      <w:pPr>
         <w:pStyle w:val="Heading2"/>
       </w:pPr>
       <w:r>
@@ -9192,6 +9271,7 @@
     <w:p>
       <w:pPr>
         <w:spacing w:after="120" w:line="360" w:lineRule="auto"/>
+        <w:jc w:val="center"/>
       </w:pPr>
       <w:r>
         <w:rPr>
@@ -9201,9 +9281,47 @@
           <w:i w:val="0"/>
           <w:sz w:val="22"/>
         </w:rPr>
-        <w:t>[Screenshot 1] — Halaman Landing Page</w:t>
+        <w:t>Halaman Landing Page (Berisi Form Lupa Sandi)</w:t>
       </w:r>
     </w:p>
+    <w:tbl>
+      <w:tblPr>
+        <w:tblStyle w:val="TableGrid"/>
+        <w:tblW w:type="auto" w:w="0"/>
+        <w:jc w:val="center"/>
+        <w:tblLook w:firstColumn="1" w:firstRow="1" w:lastColumn="0" w:lastRow="0" w:noHBand="0" w:noVBand="1" w:val="04A0"/>
+      </w:tblPr>
+      <w:tblGrid>
+        <w:gridCol w:w="7937"/>
+      </w:tblGrid>
+      <w:tr>
+        <w:tc>
+          <w:tcPr>
+            <w:tcW w:type="dxa" w:w="7937"/>
+          </w:tcPr>
+          <w:p>
+            <w:pPr>
+              <w:jc w:val="center"/>
+            </w:pPr>
+            <w:r/>
+            <w:r>
+              <w:rPr>
+                <w:rFonts w:ascii="Times New Roman" w:hAnsi="Times New Roman"/>
+                <w:b/>
+                <w:color w:val="969696"/>
+                <w:sz w:val="28"/>
+              </w:rPr>
+              <w:br/>
+              <w:br/>
+              <w:t>[TEMPEL SCREENSHOT HALAMAN LANDING PAGE (BERISI FORM LUPA SANDI) DI SINI]</w:t>
+              <w:br/>
+              <w:br/>
+            </w:r>
+          </w:p>
+        </w:tc>
+      </w:tr>
+    </w:tbl>
+    <w:p/>
     <w:p>
       <w:pPr>
         <w:spacing w:after="120" w:line="360" w:lineRule="auto"/>
@@ -9223,6 +9341,7 @@
     <w:p>
       <w:pPr>
         <w:spacing w:after="120" w:line="360" w:lineRule="auto"/>
+        <w:jc w:val="center"/>
       </w:pPr>
       <w:r>
         <w:rPr>
@@ -9232,9 +9351,47 @@
           <w:i w:val="0"/>
           <w:sz w:val="22"/>
         </w:rPr>
-        <w:t>[Screenshot 2] — Dashboard Mahasiswa</w:t>
+        <w:t>Dashboard Mahasiswa</w:t>
       </w:r>
     </w:p>
+    <w:tbl>
+      <w:tblPr>
+        <w:tblStyle w:val="TableGrid"/>
+        <w:tblW w:type="auto" w:w="0"/>
+        <w:jc w:val="center"/>
+        <w:tblLook w:firstColumn="1" w:firstRow="1" w:lastColumn="0" w:lastRow="0" w:noHBand="0" w:noVBand="1" w:val="04A0"/>
+      </w:tblPr>
+      <w:tblGrid>
+        <w:gridCol w:w="7937"/>
+      </w:tblGrid>
+      <w:tr>
+        <w:tc>
+          <w:tcPr>
+            <w:tcW w:type="dxa" w:w="7937"/>
+          </w:tcPr>
+          <w:p>
+            <w:pPr>
+              <w:jc w:val="center"/>
+            </w:pPr>
+            <w:r/>
+            <w:r>
+              <w:rPr>
+                <w:rFonts w:ascii="Times New Roman" w:hAnsi="Times New Roman"/>
+                <w:b/>
+                <w:color w:val="969696"/>
+                <w:sz w:val="28"/>
+              </w:rPr>
+              <w:br/>
+              <w:br/>
+              <w:t>[TEMPEL SCREENSHOT DASHBOARD MAHASISWA DI SINI]</w:t>
+              <w:br/>
+              <w:br/>
+            </w:r>
+          </w:p>
+        </w:tc>
+      </w:tr>
+    </w:tbl>
+    <w:p/>
     <w:p>
       <w:pPr>
         <w:spacing w:after="120" w:line="360" w:lineRule="auto"/>
@@ -9254,6 +9411,7 @@
     <w:p>
       <w:pPr>
         <w:spacing w:after="120" w:line="360" w:lineRule="auto"/>
+        <w:jc w:val="center"/>
       </w:pPr>
       <w:r>
         <w:rPr>
@@ -9263,9 +9421,47 @@
           <w:i w:val="0"/>
           <w:sz w:val="22"/>
         </w:rPr>
-        <w:t>[Screenshot 3] — Halaman Pengisian KRS</w:t>
+        <w:t>Halaman Pengisian KRS</w:t>
       </w:r>
     </w:p>
+    <w:tbl>
+      <w:tblPr>
+        <w:tblStyle w:val="TableGrid"/>
+        <w:tblW w:type="auto" w:w="0"/>
+        <w:jc w:val="center"/>
+        <w:tblLook w:firstColumn="1" w:firstRow="1" w:lastColumn="0" w:lastRow="0" w:noHBand="0" w:noVBand="1" w:val="04A0"/>
+      </w:tblPr>
+      <w:tblGrid>
+        <w:gridCol w:w="7937"/>
+      </w:tblGrid>
+      <w:tr>
+        <w:tc>
+          <w:tcPr>
+            <w:tcW w:type="dxa" w:w="7937"/>
+          </w:tcPr>
+          <w:p>
+            <w:pPr>
+              <w:jc w:val="center"/>
+            </w:pPr>
+            <w:r/>
+            <w:r>
+              <w:rPr>
+                <w:rFonts w:ascii="Times New Roman" w:hAnsi="Times New Roman"/>
+                <w:b/>
+                <w:color w:val="969696"/>
+                <w:sz w:val="28"/>
+              </w:rPr>
+              <w:br/>
+              <w:br/>
+              <w:t>[TEMPEL SCREENSHOT HALAMAN PENGISIAN KRS DI SINI]</w:t>
+              <w:br/>
+              <w:br/>
+            </w:r>
+          </w:p>
+        </w:tc>
+      </w:tr>
+    </w:tbl>
+    <w:p/>
     <w:p>
       <w:pPr>
         <w:spacing w:after="120" w:line="360" w:lineRule="auto"/>
@@ -9285,6 +9481,7 @@
     <w:p>
       <w:pPr>
         <w:spacing w:after="120" w:line="360" w:lineRule="auto"/>
+        <w:jc w:val="center"/>
       </w:pPr>
       <w:r>
         <w:rPr>
@@ -9294,9 +9491,47 @@
           <w:i w:val="0"/>
           <w:sz w:val="22"/>
         </w:rPr>
-        <w:t>[Screenshot 4] — Halaman IKM (Indeks Keaktifan Mahasiswa)</w:t>
+        <w:t>Halaman IKM (Indeks Keaktifan Mahasiswa)</w:t>
       </w:r>
     </w:p>
+    <w:tbl>
+      <w:tblPr>
+        <w:tblStyle w:val="TableGrid"/>
+        <w:tblW w:type="auto" w:w="0"/>
+        <w:jc w:val="center"/>
+        <w:tblLook w:firstColumn="1" w:firstRow="1" w:lastColumn="0" w:lastRow="0" w:noHBand="0" w:noVBand="1" w:val="04A0"/>
+      </w:tblPr>
+      <w:tblGrid>
+        <w:gridCol w:w="7937"/>
+      </w:tblGrid>
+      <w:tr>
+        <w:tc>
+          <w:tcPr>
+            <w:tcW w:type="dxa" w:w="7937"/>
+          </w:tcPr>
+          <w:p>
+            <w:pPr>
+              <w:jc w:val="center"/>
+            </w:pPr>
+            <w:r/>
+            <w:r>
+              <w:rPr>
+                <w:rFonts w:ascii="Times New Roman" w:hAnsi="Times New Roman"/>
+                <w:b/>
+                <w:color w:val="969696"/>
+                <w:sz w:val="28"/>
+              </w:rPr>
+              <w:br/>
+              <w:br/>
+              <w:t>[TEMPEL SCREENSHOT HALAMAN IKM (INDEKS KEAKTIFAN MAHASISWA) DI SINI]</w:t>
+              <w:br/>
+              <w:br/>
+            </w:r>
+          </w:p>
+        </w:tc>
+      </w:tr>
+    </w:tbl>
+    <w:p/>
     <w:p>
       <w:pPr>
         <w:spacing w:after="120" w:line="360" w:lineRule="auto"/>
@@ -9316,6 +9551,7 @@
     <w:p>
       <w:pPr>
         <w:spacing w:after="120" w:line="360" w:lineRule="auto"/>
+        <w:jc w:val="center"/>
       </w:pPr>
       <w:r>
         <w:rPr>
@@ -9325,9 +9561,47 @@
           <w:i w:val="0"/>
           <w:sz w:val="22"/>
         </w:rPr>
-        <w:t>[Screenshot 5] — Dashboard Admin BAAK</w:t>
+        <w:t>Dashboard Admin BAAK (Validasi Data)</w:t>
       </w:r>
     </w:p>
+    <w:tbl>
+      <w:tblPr>
+        <w:tblStyle w:val="TableGrid"/>
+        <w:tblW w:type="auto" w:w="0"/>
+        <w:jc w:val="center"/>
+        <w:tblLook w:firstColumn="1" w:firstRow="1" w:lastColumn="0" w:lastRow="0" w:noHBand="0" w:noVBand="1" w:val="04A0"/>
+      </w:tblPr>
+      <w:tblGrid>
+        <w:gridCol w:w="7937"/>
+      </w:tblGrid>
+      <w:tr>
+        <w:tc>
+          <w:tcPr>
+            <w:tcW w:type="dxa" w:w="7937"/>
+          </w:tcPr>
+          <w:p>
+            <w:pPr>
+              <w:jc w:val="center"/>
+            </w:pPr>
+            <w:r/>
+            <w:r>
+              <w:rPr>
+                <w:rFonts w:ascii="Times New Roman" w:hAnsi="Times New Roman"/>
+                <w:b/>
+                <w:color w:val="969696"/>
+                <w:sz w:val="28"/>
+              </w:rPr>
+              <w:br/>
+              <w:br/>
+              <w:t>[TEMPEL SCREENSHOT DASHBOARD ADMIN BAAK (VALIDASI DATA) DI SINI]</w:t>
+              <w:br/>
+              <w:br/>
+            </w:r>
+          </w:p>
+        </w:tc>
+      </w:tr>
+    </w:tbl>
+    <w:p/>
     <w:p>
       <w:pPr>
         <w:spacing w:after="120" w:line="360" w:lineRule="auto"/>
@@ -9356,7 +9630,7 @@
           <w:i/>
           <w:sz w:val="20"/>
         </w:rPr>
-        <w:t>Catatan: Silakan tambahkan screenshot dengan cara mengambil tangkapan layar (Print Screen) dari prototipe yang sedang berjalan, kemudian paste ke posisi masing-masing di atas.</w:t>
+        <w:t>Catatan: Silakan tambahkan screenshot fisik dengan cara mengambil tangkapan layar (Print Screen) dari prototipe yang sedang berjalan, kemudian timpa area Placeholder di atas.</w:t>
       </w:r>
     </w:p>
     <w:p>
@@ -9509,7 +9783,7 @@
                 <w:rFonts w:ascii="Times New Roman" w:hAnsi="Times New Roman"/>
                 <w:sz w:val="22"/>
               </w:rPr>
-              <w:t>Autentikasi</w:t>
+              <w:t>Autentikasi &amp; Keamanan</w:t>
             </w:r>
           </w:p>
         </w:tc>
@@ -9539,7 +9813,7 @@
                 <w:rFonts w:ascii="Times New Roman" w:hAnsi="Times New Roman"/>
                 <w:sz w:val="22"/>
               </w:rPr>
-              <w:t>Login dengan validasi kredensial, routing otomatis berdasarkan role, manajemen sesi via localStorage.</w:t>
+              <w:t>Login dengan validasi kredensial sistematis riil, Forgot Password verifikasi tangal lahir database, manajemen session.</w:t>
             </w:r>
           </w:p>
         </w:tc>
@@ -13200,7 +13474,7 @@
           <w:rFonts w:ascii="Times New Roman" w:hAnsi="Times New Roman"/>
           <w:color w:val="000000"/>
         </w:rPr>
-        <w:t>KESIMPULAN DAN SARAN</w:t>
+        <w:t>PEMELIHARAAN (MAINTENANCE)</w:t>
       </w:r>
     </w:p>
     <w:p/>
@@ -13214,7 +13488,187 @@
           <w:rFonts w:ascii="Times New Roman" w:hAnsi="Times New Roman"/>
           <w:color w:val="000000"/>
         </w:rPr>
-        <w:t>8.1 Kesimpulan</w:t>
+        <w:t>8.1 Rencana Pemeliharaan</w:t>
+      </w:r>
+    </w:p>
+    <w:p>
+      <w:pPr>
+        <w:spacing w:after="120" w:line="360" w:lineRule="auto"/>
+      </w:pPr>
+      <w:r>
+        <w:rPr>
+          <w:rFonts w:ascii="Times New Roman" w:hAnsi="Times New Roman" w:cs="Times New Roman"/>
+          <w:rFonts w:ascii="Times New Roman" w:hAnsi="Times New Roman"/>
+          <w:b w:val="0"/>
+          <w:i w:val="0"/>
+          <w:sz w:val="24"/>
+        </w:rPr>
+        <w:t>Pemeliharaan (Maintenance) adalah tahapan terakhir dalam SDLC yang sangat vital untuk memastikan sistem SIAKAD Reborn tetap berjalan optimal seiring waktu. Rencana pemeliharaan ini disusun ke dalam 3 jenis:</w:t>
+      </w:r>
+    </w:p>
+    <w:p>
+      <w:pPr>
+        <w:pStyle w:val="ListBullet"/>
+        <w:spacing w:line="360" w:lineRule="auto"/>
+      </w:pPr>
+      <w:r>
+        <w:rPr>
+          <w:rFonts w:ascii="Times New Roman" w:hAnsi="Times New Roman"/>
+          <w:rFonts w:ascii="Times New Roman" w:hAnsi="Times New Roman"/>
+          <w:b w:val="0"/>
+          <w:sz w:val="24"/>
+        </w:rPr>
+        <w:t>Pemeliharaan Korektif (Corrective): Memperbaiki bug atau anomali sistem (seperti database timeout atau kendala sinkronisasi data UI) yang mungkin muncul ketika digunakan secara massal oleh ribuan mahasiswa LP3I saat pengisian KRS.</w:t>
+      </w:r>
+    </w:p>
+    <w:p>
+      <w:pPr>
+        <w:pStyle w:val="ListBullet"/>
+        <w:spacing w:line="360" w:lineRule="auto"/>
+      </w:pPr>
+      <w:r>
+        <w:rPr>
+          <w:rFonts w:ascii="Times New Roman" w:hAnsi="Times New Roman"/>
+          <w:rFonts w:ascii="Times New Roman" w:hAnsi="Times New Roman"/>
+          <w:b w:val="0"/>
+          <w:sz w:val="24"/>
+        </w:rPr>
+        <w:t>Pemeliharaan Adaptif (Adaptive): Menyesuaikan Modul Backend Node.js dan Frontend React dengan versi dependensi terbaru (libraries) untuk menghindari celah keamanan (vulnerability).</w:t>
+      </w:r>
+    </w:p>
+    <w:p>
+      <w:pPr>
+        <w:pStyle w:val="ListBullet"/>
+        <w:spacing w:line="360" w:lineRule="auto"/>
+      </w:pPr>
+      <w:r>
+        <w:rPr>
+          <w:rFonts w:ascii="Times New Roman" w:hAnsi="Times New Roman"/>
+          <w:rFonts w:ascii="Times New Roman" w:hAnsi="Times New Roman"/>
+          <w:b w:val="0"/>
+          <w:sz w:val="24"/>
+        </w:rPr>
+        <w:t>Pemeliharaan Perfektif (Perfective): Melakukan penyempurnaan UI/UX secara bertahap dan menambahkan fitur minor seperti notifikasi Push (Service Worker) berdasarkan feedback pengguna akademik tanpa mengubah proses inti bisnis.</w:t>
+      </w:r>
+    </w:p>
+    <w:p>
+      <w:pPr>
+        <w:pStyle w:val="Heading2"/>
+      </w:pPr>
+      <w:r>
+        <w:rPr>
+          <w:rFonts w:ascii="Times New Roman" w:hAnsi="Times New Roman" w:cs="Times New Roman"/>
+          <w:rFonts w:ascii="Times New Roman" w:hAnsi="Times New Roman"/>
+          <w:color w:val="000000"/>
+        </w:rPr>
+        <w:t>8.2 Perawatan Sistem</w:t>
+      </w:r>
+    </w:p>
+    <w:p>
+      <w:pPr>
+        <w:spacing w:after="120" w:line="360" w:lineRule="auto"/>
+      </w:pPr>
+      <w:r>
+        <w:rPr>
+          <w:rFonts w:ascii="Times New Roman" w:hAnsi="Times New Roman" w:cs="Times New Roman"/>
+          <w:rFonts w:ascii="Times New Roman" w:hAnsi="Times New Roman"/>
+          <w:b w:val="0"/>
+          <w:i w:val="0"/>
+          <w:sz w:val="24"/>
+        </w:rPr>
+        <w:t>Untuk menjaga kinerja operasional sistem, perawatan terjadwal akan dilakukan:</w:t>
+      </w:r>
+    </w:p>
+    <w:p>
+      <w:pPr>
+        <w:pStyle w:val="ListBullet"/>
+        <w:spacing w:line="360" w:lineRule="auto"/>
+      </w:pPr>
+      <w:r>
+        <w:rPr>
+          <w:rFonts w:ascii="Times New Roman" w:hAnsi="Times New Roman"/>
+          <w:rFonts w:ascii="Times New Roman" w:hAnsi="Times New Roman"/>
+          <w:b w:val="0"/>
+          <w:sz w:val="24"/>
+        </w:rPr>
+        <w:t>Database Backup: Mencadangkan (backup) tabel-tabel MySQL krusial (KRS, Nilai, Keuangan) setiap minggu ke External Storage (Harddisk) guna mitigasi bencana.</w:t>
+      </w:r>
+    </w:p>
+    <w:p>
+      <w:pPr>
+        <w:pStyle w:val="ListBullet"/>
+        <w:spacing w:line="360" w:lineRule="auto"/>
+      </w:pPr>
+      <w:r>
+        <w:rPr>
+          <w:rFonts w:ascii="Times New Roman" w:hAnsi="Times New Roman"/>
+          <w:rFonts w:ascii="Times New Roman" w:hAnsi="Times New Roman"/>
+          <w:b w:val="0"/>
+          <w:sz w:val="24"/>
+        </w:rPr>
+        <w:t>Log Monitoring: Memeriksa Node.js / Express log untuk mendeteksi anomali request dan memitigasi serangan traffic (DDoS) dari luar kampus.</w:t>
+      </w:r>
+    </w:p>
+    <w:p>
+      <w:pPr>
+        <w:pStyle w:val="ListBullet"/>
+        <w:spacing w:line="360" w:lineRule="auto"/>
+      </w:pPr>
+      <w:r>
+        <w:rPr>
+          <w:rFonts w:ascii="Times New Roman" w:hAnsi="Times New Roman"/>
+          <w:rFonts w:ascii="Times New Roman" w:hAnsi="Times New Roman"/>
+          <w:b w:val="0"/>
+          <w:sz w:val="24"/>
+        </w:rPr>
+        <w:t>Purge Cache Data: Membersihkan tumpukan cache data mahasiswa pada Browser localStorage setiap satu semester sekali agar ukuran file tidak membebani kapasitas peramban HP Mahasiswa.</w:t>
+      </w:r>
+    </w:p>
+    <w:p>
+      <w:r>
+        <w:br w:type="page"/>
+      </w:r>
+    </w:p>
+    <w:p>
+      <w:pPr>
+        <w:pStyle w:val="Heading1"/>
+        <w:jc w:val="center"/>
+      </w:pPr>
+      <w:r>
+        <w:rPr>
+          <w:rFonts w:ascii="Times New Roman" w:hAnsi="Times New Roman" w:cs="Times New Roman"/>
+          <w:rFonts w:ascii="Times New Roman" w:hAnsi="Times New Roman"/>
+          <w:color w:val="000000"/>
+        </w:rPr>
+        <w:t>BAB IX</w:t>
+      </w:r>
+    </w:p>
+    <w:p>
+      <w:pPr>
+        <w:pStyle w:val="Heading1"/>
+        <w:jc w:val="center"/>
+      </w:pPr>
+      <w:r>
+        <w:rPr>
+          <w:rFonts w:ascii="Times New Roman" w:hAnsi="Times New Roman" w:cs="Times New Roman"/>
+          <w:rFonts w:ascii="Times New Roman" w:hAnsi="Times New Roman"/>
+          <w:color w:val="000000"/>
+        </w:rPr>
+        <w:t>KESIMPULAN DAN SARAN</w:t>
+      </w:r>
+    </w:p>
+    <w:p/>
+    <w:p>
+      <w:pPr>
+        <w:pStyle w:val="Heading2"/>
+      </w:pPr>
+      <w:r>
+        <w:rPr>
+          <w:rFonts w:ascii="Times New Roman" w:hAnsi="Times New Roman" w:cs="Times New Roman"/>
+          <w:rFonts w:ascii="Times New Roman" w:hAnsi="Times New Roman"/>
+          <w:color w:val="000000"/>
+        </w:rPr>
+        <w:t>9.1 Kesimpulan</w:t>
       </w:r>
     </w:p>
     <w:p>
@@ -13259,7 +13713,7 @@
           <w:b w:val="0"/>
           <w:sz w:val="24"/>
         </w:rPr>
-        <w:t>Dengan menerapkan metode SDLC model Waterfall, berhasil dirancang sistem SIAKAD baru (SIAKAD Reborn) yang memiliki keunggulan signifikan dibanding sistem lama, meliputi: antarmuka modern dan responsif, arsitektur terpisah (decoupled), pusat validasi terpusat, sistem IKM berbasis poin yang komprehensif, integrasi modul literasi digital, dan helpdesk terintegrasi.</w:t>
+        <w:t>Dengan menerapkan metode SDLC model Waterfall, berhasil merancang sistem SIAKAD baru (SIAKAD Reborn) yang mengakomodasi 6 tahapan murni: Planning, Analysis, Design, Implementation, Testing &amp; Evaluasi, hingga tahapan Maintenance jangka panjang sistem.</w:t>
       </w:r>
     </w:p>
     <w:p>
@@ -13274,7 +13728,7 @@
           <w:b w:val="0"/>
           <w:sz w:val="24"/>
         </w:rPr>
-        <w:t>Prototipe aplikasi SIAKAD Reborn telah berhasil dibangun menggunakan React.js, Node.js, Express.js, dan MySQL. Prototipe ini bersifat fungsional dan siap deploy dengan 25+ modul yang terintegrasi dan mencakup 3 role pengguna (Mahasiswa, Dosen, Admin BAAK).</w:t>
+        <w:t>Prototipe aplikasi SIAKAD Reborn telah berhasil dibangun menggunakan React.js, Node.js, Express.js, dan MySQL. Prototipe ini bersifat fungsional dan siap deploy dengan mekanisme Multer untuk upload berkas terpusat dan verifikasi otentik Lupa Kata Sandi.</w:t>
       </w:r>
     </w:p>
     <w:p>
@@ -13294,21 +13748,6 @@
     </w:p>
     <w:p>
       <w:pPr>
-        <w:pStyle w:val="ListBullet"/>
-        <w:spacing w:line="360" w:lineRule="auto"/>
-      </w:pPr>
-      <w:r>
-        <w:rPr>
-          <w:rFonts w:ascii="Times New Roman" w:hAnsi="Times New Roman"/>
-          <w:rFonts w:ascii="Times New Roman" w:hAnsi="Times New Roman"/>
-          <w:b w:val="0"/>
-          <w:sz w:val="24"/>
-        </w:rPr>
-        <w:t>Sistem baru berhasil mengatasi kekurangan sistem lama terutama dalam aspek: (1) user experience, (2) integrasi antar modul, (3) otomatisasi proses administrasi, dan (4) penambahan fitur-fitur baru yang relevan dengan kebutuhan pendidikan era digital.</w:t>
-      </w:r>
-    </w:p>
-    <w:p>
-      <w:pPr>
         <w:pStyle w:val="Heading2"/>
       </w:pPr>
       <w:r>
@@ -13317,7 +13756,7 @@
           <w:rFonts w:ascii="Times New Roman" w:hAnsi="Times New Roman"/>
           <w:color w:val="000000"/>
         </w:rPr>
-        <w:t>8.2 Saran Pengembangan</w:t>
+        <w:t>9.2 Saran Pengembangan</w:t>
       </w:r>
     </w:p>
     <w:p>
@@ -13392,37 +13831,7 @@
           <w:b w:val="0"/>
           <w:sz w:val="24"/>
         </w:rPr>
-        <w:t>Penambahan fitur notifikasi real-time menggunakan WebSocket agar pengguna mendapat pemberitahuan instan ketika ada perubahan status pada pengajuan mereka.</w:t>
-      </w:r>
-    </w:p>
-    <w:p>
-      <w:pPr>
-        <w:pStyle w:val="ListBullet"/>
-        <w:spacing w:line="360" w:lineRule="auto"/>
-      </w:pPr>
-      <w:r>
-        <w:rPr>
-          <w:rFonts w:ascii="Times New Roman" w:hAnsi="Times New Roman"/>
-          <w:rFonts w:ascii="Times New Roman" w:hAnsi="Times New Roman"/>
-          <w:b w:val="0"/>
-          <w:sz w:val="24"/>
-        </w:rPr>
-        <w:t>Deployment ke server cloud (AWS, GCP, atau Heroku) agar sistem dapat diakses secara publik oleh seluruh civitas akademika.</w:t>
-      </w:r>
-    </w:p>
-    <w:p>
-      <w:pPr>
-        <w:pStyle w:val="ListBullet"/>
-        <w:spacing w:line="360" w:lineRule="auto"/>
-      </w:pPr>
-      <w:r>
-        <w:rPr>
-          <w:rFonts w:ascii="Times New Roman" w:hAnsi="Times New Roman"/>
-          <w:rFonts w:ascii="Times New Roman" w:hAnsi="Times New Roman"/>
-          <w:b w:val="0"/>
-          <w:sz w:val="24"/>
-        </w:rPr>
-        <w:t>Implementasi fitur pembuatan laporan (reporting) dan dashboard analytics untuk mendukung pengambilan keputusan oleh pihak manajemen kampus.</w:t>
+        <w:t>Deployment ke server publik (Cloud) agar sistem dapat diakses secara global oleh seluruh civitas akademika Politeknik LP3I.</w:t>
       </w:r>
     </w:p>
     <w:p>

</xml_diff>